<commit_message>
Repair TR3 package and source authority
</commit_message>
<xml_diff>
--- a/reports/tr3/report/Vinci_Technical_Report_No_3.docx
+++ b/reports/tr3/report/Vinci_Technical_Report_No_3.docx
@@ -821,14 +821,6 @@
       </w:pPr>
       <w:r>
         <w:t xml:space="preserve">All model results in this report are development-tier internal evidence. No sealed primary product-weighted holdout was opened, no external peer review was performed, and no independent external laboratory reproduced the result. Several evaluator audits were designed and run after defects were discovered rather than before the model experiment. They are valuable diagnostic evidence, not confirmatory evidence about a pre-registered auditor hypothesis.</w:t>
-      </w:r>
-    </w:p>
-    <w:p>
-      <w:pPr>
-        <w:pStyle w:val="BodyText"/>
-      </w:pPr>
-      <w:r>
-        <w:t xml:space="preserve">The final report must bind to one source commit and one evidence cutoff. This draft intentionally leaves that field unresolved. Continued evaluator engineering after the cutoff should be treated as successor work rather than allowed to reopen the completed model-intervention result indefinitely.</w:t>
       </w:r>
     </w:p>
     <w:bookmarkEnd w:id="21"/>

</xml_diff>

<commit_message>
Separate TR3 correction candidate from historical PDF
</commit_message>
<xml_diff>
--- a/reports/tr3/report/Vinci_Technical_Report_No_3.docx
+++ b/reports/tr3/report/Vinci_Technical_Report_No_3.docx
@@ -60,6 +60,48 @@
         </w:p>
       </w:sdtContent>
     </w:sdt>
+    <w:p>
+      <w:pPr>
+        <w:pStyle w:val="BlockText"/>
+      </w:pPr>
+      <w:r>
+        <w:rPr>
+          <w:b/>
+          <w:bCs/>
+        </w:rPr>
+        <w:t xml:space="preserve">Unpublished corrected candidate — package revision 1.0.3.</w:t>
+      </w:r>
+      <w:r>
+        <w:t xml:space="preserve"> </w:t>
+      </w:r>
+      <w:r>
+        <w:t xml:space="preserve">This</w:t>
+      </w:r>
+      <w:r>
+        <w:t xml:space="preserve"> </w:t>
+      </w:r>
+      <w:r>
+        <w:t xml:space="preserve">repository-forward derivative has not been published, tagged, uploaded to</w:t>
+      </w:r>
+      <w:r>
+        <w:t xml:space="preserve"> </w:t>
+      </w:r>
+      <w:r>
+        <w:t xml:space="preserve">Zenodo, or submitted to arXiv. The published v1.0 PDF remains a frozen</w:t>
+      </w:r>
+      <w:r>
+        <w:t xml:space="preserve"> </w:t>
+      </w:r>
+      <w:r>
+        <w:t xml:space="preserve">historical artifact and contains residual pre-finalization instructions that</w:t>
+      </w:r>
+      <w:r>
+        <w:t xml:space="preserve"> </w:t>
+      </w:r>
+      <w:r>
+        <w:t xml:space="preserve">are corrected in this candidate.</w:t>
+      </w:r>
+    </w:p>
     <w:bookmarkStart w:id="13" w:name="abstract"/>
     <w:p>
       <w:pPr>
@@ -5344,7 +5386,7 @@
         <w:t xml:space="preserve">p-breve-01-r2/docs/BLIND-ADVERSARIAL-POPULATION.md</w:t>
       </w:r>
       <w:r>
-        <w:t xml:space="preserve">, section “The protected bank leaks worse than staging.” Version 1.0 verified the source at working commit</w:t>
+        <w:t xml:space="preserve">, section “The protected bank leaks worse than staging.” Version 1.0 verified the source at evidence-cutoff commit</w:t>
       </w:r>
       <w:r>
         <w:t xml:space="preserve"> </w:t>
@@ -5410,7 +5452,34 @@
         <w:t xml:space="preserve">provably-wrong mutants = 1,862</w:t>
       </w:r>
       <w:r>
-        <w:t xml:space="preserve">; it is not a separately stored observation. The final publication manifest must rebind the source cells and derivation to the merged evidence-cutoff commit.</w:t>
+        <w:t xml:space="preserve">; it is not a separately stored observation. The repository-forward package binds that source identity in</w:t>
+      </w:r>
+      <w:r>
+        <w:t xml:space="preserve"> </w:t>
+      </w:r>
+      <w:r>
+        <w:rPr>
+          <w:rStyle w:val="VerbatimChar"/>
+        </w:rPr>
+        <w:t xml:space="preserve">data/evidence_bindings.json</w:t>
+      </w:r>
+      <w:r>
+        <w:t xml:space="preserve"> </w:t>
+      </w:r>
+      <w:r>
+        <w:t xml:space="preserve">and the rendered numerator, denominator, rate, and derivation in</w:t>
+      </w:r>
+      <w:r>
+        <w:t xml:space="preserve"> </w:t>
+      </w:r>
+      <w:r>
+        <w:rPr>
+          <w:rStyle w:val="VerbatimChar"/>
+        </w:rPr>
+        <w:t xml:space="preserve">data/evaluator_metrics.json</w:t>
+      </w:r>
+      <w:r>
+        <w:t xml:space="preserve">.</w:t>
       </w:r>
     </w:p>
     <w:p>
@@ -8791,7 +8860,19 @@
         </w:numPr>
       </w:pPr>
       <w:r>
-        <w:t xml:space="preserve">Publication source commit: recorded in the release notes for tag</w:t>
+        <w:t xml:space="preserve">Published v1.0 source commit:</w:t>
+      </w:r>
+      <w:r>
+        <w:t xml:space="preserve"> </w:t>
+      </w:r>
+      <w:r>
+        <w:rPr>
+          <w:rStyle w:val="VerbatimChar"/>
+        </w:rPr>
+        <w:t xml:space="preserve">128dea8b4013cdb3398c98edab5dc930e24c51d2</w:t>
+      </w:r>
+      <w:r>
+        <w:t xml:space="preserve">, recorded by tag</w:t>
       </w:r>
       <w:r>
         <w:t xml:space="preserve"> </w:t>
@@ -8883,7 +8964,55 @@
         <w:pStyle w:val="FirstParagraph"/>
       </w:pPr>
       <w:r>
-        <w:t xml:space="preserve">The core evaluator analyses are represented by committed scripts and content-addressed outputs. The final release manifest should bind at least the following:</w:t>
+        <w:t xml:space="preserve">The core evaluator analyses were run from the following private implementations. Their evidence identities are fixed in</w:t>
+      </w:r>
+      <w:r>
+        <w:t xml:space="preserve"> </w:t>
+      </w:r>
+      <w:r>
+        <w:rPr>
+          <w:rStyle w:val="VerbatimChar"/>
+        </w:rPr>
+        <w:t xml:space="preserve">data/evidence_bindings.json</w:t>
+      </w:r>
+      <w:r>
+        <w:t xml:space="preserve">; the public aggregate values and derivations distributed with this report are fixed in</w:t>
+      </w:r>
+      <w:r>
+        <w:t xml:space="preserve"> </w:t>
+      </w:r>
+      <w:r>
+        <w:rPr>
+          <w:rStyle w:val="VerbatimChar"/>
+        </w:rPr>
+        <w:t xml:space="preserve">data/evaluator_metrics.json</w:t>
+      </w:r>
+      <w:r>
+        <w:t xml:space="preserve">,</w:t>
+      </w:r>
+      <w:r>
+        <w:t xml:space="preserve"> </w:t>
+      </w:r>
+      <w:r>
+        <w:rPr>
+          <w:rStyle w:val="VerbatimChar"/>
+        </w:rPr>
+        <w:t xml:space="preserve">data/headline_metrics.json</w:t>
+      </w:r>
+      <w:r>
+        <w:t xml:space="preserve">, and</w:t>
+      </w:r>
+      <w:r>
+        <w:t xml:space="preserve"> </w:t>
+      </w:r>
+      <w:r>
+        <w:rPr>
+          <w:rStyle w:val="VerbatimChar"/>
+        </w:rPr>
+        <w:t xml:space="preserve">data/serving_control.json</w:t>
+      </w:r>
+      <w:r>
+        <w:t xml:space="preserve">.</w:t>
       </w:r>
     </w:p>
     <w:tbl>
@@ -9231,7 +9360,19 @@
         <w:pStyle w:val="BodyText"/>
       </w:pPr>
       <w:r>
-        <w:t xml:space="preserve">The original verifier audit was run with explicit zero-tolerance thresholds rather than hidden defaults. The batch-2 qualification similarly recorded the exact frozen authority hashes on every run. Publication scripts should refuse to render if a cited evidence digest is missing or if a table value differs from its machine-readable source.</w:t>
+        <w:t xml:space="preserve">The original verifier audit was run with explicit zero-tolerance thresholds rather than hidden defaults. The batch-2 qualification similarly recorded the exact frozen authority hashes on every run. For this repository-forward candidate, the package inventory binds the distributed evidence records and rendered surfaces by SHA-256; the private-record commit and blob identities remain independently listed in</w:t>
+      </w:r>
+      <w:r>
+        <w:t xml:space="preserve"> </w:t>
+      </w:r>
+      <w:r>
+        <w:rPr>
+          <w:rStyle w:val="VerbatimChar"/>
+        </w:rPr>
+        <w:t xml:space="preserve">data/evidence_bindings.json</w:t>
+      </w:r>
+      <w:r>
+        <w:t xml:space="preserve">.</w:t>
       </w:r>
     </w:p>
     <w:bookmarkEnd w:id="85"/>
@@ -9350,13 +9491,13 @@
       </w:r>
     </w:p>
     <w:bookmarkEnd w:id="86"/>
-    <w:bookmarkStart w:id="87" w:name="X271a0b1cbe2ba0c26f5e7663f1a2109eab2b130"/>
+    <w:bookmarkStart w:id="87" w:name="X8040ff2125febb7067b4bb064f06e78c2cf4564"/>
     <w:p>
       <w:pPr>
         <w:pStyle w:val="Heading3"/>
       </w:pPr>
       <w:r>
-        <w:t xml:space="preserve">8.4 Recommended publication manifest</w:t>
+        <w:t xml:space="preserve">8.4 Publication manifest standard</w:t>
       </w:r>
     </w:p>
     <w:p>
@@ -9364,7 +9505,34 @@
         <w:pStyle w:val="FirstParagraph"/>
       </w:pPr>
       <w:r>
-        <w:t xml:space="preserve">The final report package should contain one machine-readable manifest with:</w:t>
+        <w:t xml:space="preserve">At report cutoff, the program adopted the following archival-manifest standard. The public package records its distributed-file inventory in</w:t>
+      </w:r>
+      <w:r>
+        <w:t xml:space="preserve"> </w:t>
+      </w:r>
+      <w:r>
+        <w:rPr>
+          <w:rStyle w:val="VerbatimChar"/>
+        </w:rPr>
+        <w:t xml:space="preserve">MANIFEST.json</w:t>
+      </w:r>
+      <w:r>
+        <w:t xml:space="preserve"> </w:t>
+      </w:r>
+      <w:r>
+        <w:t xml:space="preserve">and</w:t>
+      </w:r>
+      <w:r>
+        <w:t xml:space="preserve"> </w:t>
+      </w:r>
+      <w:r>
+        <w:rPr>
+          <w:rStyle w:val="VerbatimChar"/>
+        </w:rPr>
+        <w:t xml:space="preserve">CHECKSUMS.sha256</w:t>
+      </w:r>
+      <w:r>
+        <w:t xml:space="preserve">; restricted research identities remain in the evidence register described in Section 8.1.</w:t>
       </w:r>
     </w:p>
     <w:p>
@@ -9617,7 +9785,7 @@
         <w:pStyle w:val="BodyText"/>
       </w:pPr>
       <w:r>
-        <w:t xml:space="preserve">No model, evaluator bank, or product claim from P-BREVE-01-R2 is recommended for release. The report itself is the release candidate.</w:t>
+        <w:t xml:space="preserve">No model, evaluator bank, or product claim from P-BREVE-01-R2 is recommended for release. The report was selected as the program's sole public release artifact.</w:t>
       </w:r>
     </w:p>
     <w:bookmarkEnd w:id="89"/>
@@ -9955,7 +10123,19 @@
         <w:pStyle w:val="BodyText"/>
       </w:pPr>
       <w:r>
-        <w:t xml:space="preserve">This appendix will be machine-checked in a successor version. The “public sentence” column is deliberately narrower than the underlying internal record.</w:t>
+        <w:t xml:space="preserve">This appendix is the final human-readable claim-to-evidence boundary for the v1.0 analysis. The “public sentence” column is deliberately narrower than the underlying internal record, and the distributed claim dispositions are machine-readable in</w:t>
+      </w:r>
+      <w:r>
+        <w:t xml:space="preserve"> </w:t>
+      </w:r>
+      <w:r>
+        <w:rPr>
+          <w:rStyle w:val="VerbatimChar"/>
+        </w:rPr>
+        <w:t xml:space="preserve">data/claim_dispositions.json</w:t>
+      </w:r>
+      <w:r>
+        <w:t xml:space="preserve">.</w:t>
       </w:r>
     </w:p>
     <w:bookmarkStart w:id="98" w:name="a1-derived-quantity-register"/>
@@ -9972,7 +10152,19 @@
         <w:pStyle w:val="FirstParagraph"/>
       </w:pPr>
       <w:r>
-        <w:t xml:space="preserve">A source hash proves which bytes were read; it does not by itself define how adjacent fields were assembled into a report-level ratio or union. The final manifest should encode the following derivations directly.</w:t>
+        <w:t xml:space="preserve">A source hash proves which bytes were read; it does not by itself define how adjacent fields were assembled into a report-level ratio or union. The package records the following derivations directly in</w:t>
+      </w:r>
+      <w:r>
+        <w:t xml:space="preserve"> </w:t>
+      </w:r>
+      <w:r>
+        <w:rPr>
+          <w:rStyle w:val="VerbatimChar"/>
+        </w:rPr>
+        <w:t xml:space="preserve">data/evaluator_metrics.json</w:t>
+      </w:r>
+      <w:r>
+        <w:t xml:space="preserve">; this table is their report rendering.</w:t>
       </w:r>
     </w:p>
     <w:tbl>
@@ -11839,7 +12031,43 @@
         <w:pStyle w:val="BodyText"/>
       </w:pPr>
       <w:r>
-        <w:t xml:space="preserve">The final version should replace approximate day-level entries with exact commits and artifact hashes generated mechanically from the repository history.</w:t>
+        <w:t xml:space="preserve">This chronology intentionally remains day-level context rather than a commit ledger. Exact identities for the report source, evidence cutoff, underlying evidence blobs, and distributed artifacts are recorded in Section 8.1,</w:t>
+      </w:r>
+      <w:r>
+        <w:t xml:space="preserve"> </w:t>
+      </w:r>
+      <w:r>
+        <w:rPr>
+          <w:rStyle w:val="VerbatimChar"/>
+        </w:rPr>
+        <w:t xml:space="preserve">data/evidence_bindings.json</w:t>
+      </w:r>
+      <w:r>
+        <w:t xml:space="preserve">,</w:t>
+      </w:r>
+      <w:r>
+        <w:t xml:space="preserve"> </w:t>
+      </w:r>
+      <w:r>
+        <w:rPr>
+          <w:rStyle w:val="VerbatimChar"/>
+        </w:rPr>
+        <w:t xml:space="preserve">MANIFEST.json</w:t>
+      </w:r>
+      <w:r>
+        <w:t xml:space="preserve">, and</w:t>
+      </w:r>
+      <w:r>
+        <w:t xml:space="preserve"> </w:t>
+      </w:r>
+      <w:r>
+        <w:rPr>
+          <w:rStyle w:val="VerbatimChar"/>
+        </w:rPr>
+        <w:t xml:space="preserve">CHECKSUMS.sha256</w:t>
+      </w:r>
+      <w:r>
+        <w:t xml:space="preserve">.</w:t>
       </w:r>
     </w:p>
     <w:bookmarkEnd w:id="101"/>
@@ -12913,7 +13141,34 @@
         <w:pStyle w:val="BodyText"/>
       </w:pPr>
       <w:r>
-        <w:t xml:space="preserve">The publication source commit and release tag are recorded in the release notes rather than in this document, so that this text does not depend on identifiers assigned after the artifact is built.</w:t>
+        <w:t xml:space="preserve">The published v1.0 source commit is</w:t>
+      </w:r>
+      <w:r>
+        <w:t xml:space="preserve"> </w:t>
+      </w:r>
+      <w:r>
+        <w:rPr>
+          <w:rStyle w:val="VerbatimChar"/>
+        </w:rPr>
+        <w:t xml:space="preserve">128dea8b4013cdb3398c98edab5dc930e24c51d2</w:t>
+      </w:r>
+      <w:r>
+        <w:t xml:space="preserve"> </w:t>
+      </w:r>
+      <w:r>
+        <w:t xml:space="preserve">and its release tag is</w:t>
+      </w:r>
+      <w:r>
+        <w:t xml:space="preserve"> </w:t>
+      </w:r>
+      <w:r>
+        <w:rPr>
+          <w:rStyle w:val="VerbatimChar"/>
+        </w:rPr>
+        <w:t xml:space="preserve">tr3-v1.0.0</w:t>
+      </w:r>
+      <w:r>
+        <w:t xml:space="preserve">; both are also recorded in the release metadata.</w:t>
       </w:r>
     </w:p>
     <w:bookmarkEnd w:id="109"/>

</xml_diff>